<commit_message>
Add Papalexi target-held-out validation
</commit_message>
<xml_diff>
--- a/deliverables/FusionVI-X_Technical_Report.docx
+++ b/deliverables/FusionVI-X_Technical_Report.docx
@@ -18,7 +18,7 @@
           <w:color w:val="167D8D"/>
           <w:sz w:val="30"/>
         </w:rPr>
-        <w:t>Targeted cross-modal recovery of pharmacodynamic surface markers</w:t>
+        <w:t>Cross-modal recovery of surface biomarkers in unseen donors and perturbations</w:t>
       </w:r>
     </w:p>
     <w:p>
@@ -41,7 +41,7 @@
         <w:keepLines/>
       </w:pPr>
       <w:r>
-        <w:t>When immune stimulation produces disagreement between transcript and surface-protein evidence, can targeted cross-modal context recover hidden CD25, CD69 and HLA-DR surface markers in unseen donors more reliably than standard totalVI?</w:t>
+        <w:t>When transcript and surface-protein evidence disagree, can targeted cross-modal context recover hidden therapeutic surface biomarkers in unseen donors and after unseen molecular perturbations more reliably than standard totalVI?</w:t>
       </w:r>
     </w:p>
     <w:p>
@@ -59,7 +59,7 @@
         <w:keepLines/>
       </w:pPr>
       <w:r>
-        <w:t>The scalar FusionVI gate learned biologically structured modality weights but did not improve marker recovery by itself. Adding a donor-nested, target-specific cross-modal readout produced a clear positive result. Relative to standard totalVI, FusionVI-X increased mean held-out-donor Spearman correlation from 0.779 to 0.825 for CD25, 0.822 to 0.873 for CD69 and 0.404 to 0.756 for HLA-DR. In HLA-DR RNA-protein-discordant monocytes, correlation changed from -0.175 to 0.637. The ablation showed why: other surface proteins rescued signal when marker-matched RNA pointed in the wrong direction.</w:t>
+        <w:t>The scalar FusionVI gate learned biologically structured modality weights but did not improve marker recovery by itself. A target-specific cross-modal readout produced the useful result. In the Lawlor donor-held-out experiment, FusionVI-X increased mean Spearman correlation from 0.779 to 0.825 for CD25, 0.822 to 0.873 for CD69 and 0.404 to 0.756 for HLA-DR relative to standard totalVI. In the Papalexi external validation, FusionVI-X predicted surface PD-L1 effects for unseen CRISPR targets with Spearman correlation 0.879 and 84% direction accuracy, compared with 0.587 and 64% for CD274 RNA alone.</w:t>
       </w:r>
     </w:p>
     <w:p>
@@ -102,7 +102,7 @@
               <w:rPr>
                 <w:b/>
               </w:rPr>
-              <w:t>Dataset</w:t>
+              <w:t>Experiment 1</w:t>
             </w:r>
           </w:p>
         </w:tc>
@@ -114,6 +114,34 @@
           <w:p>
             <w:r>
               <w:t>16,382 PBMCs, 10 paired donors, 3 conditions, 4,000 RNA features and 39 ADTs</w:t>
+            </w:r>
+          </w:p>
+        </w:tc>
+      </w:tr>
+      <w:tr>
+        <w:tc>
+          <w:tcPr>
+            <w:tcW w:type="dxa" w:w="5040"/>
+            <w:shd w:fill="EAF4F5"/>
+            <w:vAlign w:val="center"/>
+          </w:tcPr>
+          <w:p>
+            <w:r>
+              <w:rPr>
+                <w:b/>
+              </w:rPr>
+              <w:t>Experiment 2</w:t>
+            </w:r>
+          </w:p>
+        </w:tc>
+        <w:tc>
+          <w:tcPr>
+            <w:tcW w:type="dxa" w:w="5040"/>
+            <w:vAlign w:val="center"/>
+          </w:tcPr>
+          <w:p>
+            <w:r>
+              <w:t>20,729 IFN-gamma-treated THP-1 cells, 25 CRISPR targets, 3 replicates and 4 ADTs</w:t>
             </w:r>
           </w:p>
         </w:tc>
@@ -225,7 +253,7 @@
           </w:tcPr>
           <w:p>
             <w:r>
-              <w:t>Targeted cross-modal context improved all three global marker endpoints</w:t>
+              <w:t>Cross-modal context improved hidden markers across donors and unseen perturbations</w:t>
             </w:r>
           </w:p>
         </w:tc>
@@ -2064,7 +2092,428 @@
         <w:keepNext/>
       </w:pPr>
       <w:r>
-        <w:t>7 Limitations</w:t>
+        <w:t>7 Experiment 2: unseen CRISPR targets</w:t>
+      </w:r>
+    </w:p>
+    <w:p>
+      <w:pPr>
+        <w:keepLines/>
+      </w:pPr>
+      <w:r>
+        <w:t>The Papalexi et al. ECCITE-seq screen provides a direct therapeutic test of the same principle. It measured RNA, CRISPR guide identity and four surface proteins in 20,729 IFN-gamma-treated THP-1 cells across three biological replicates. The biological question was whether cross-modal context could predict how an unseen molecular perturbation changes surface PD-L1, a clinically used immune-checkpoint biomarker, when CD274 RNA may provide incomplete evidence.</w:t>
+      </w:r>
+    </w:p>
+    <w:p>
+      <w:pPr>
+        <w:pStyle w:val="Heading2"/>
+        <w:keepLines/>
+        <w:keepNext/>
+      </w:pPr>
+      <w:r>
+        <w:t>Target-held-out design</w:t>
+      </w:r>
+    </w:p>
+    <w:p>
+      <w:pPr>
+        <w:keepLines/>
+      </w:pPr>
+      <w:r>
+        <w:t>PD-L1 was masked at the encoder input. The model retained 2,000 highly variable genes, including CD274, and the three other surface proteins CD86, PD-L2 and CD366. Five outer folds kept every cell targeting the same gene together, so each of 25 perturbed genes was evaluated exactly once and never appeared in that fold's training set. Non-targeting cells were partitioned within replicate to provide an untouched control reference. Ridge and Extra Trees readouts were selected through inner validation grouped by CRISPR target. Evaluation used 75 target-by-replicate effects rather than cell-level significance tests.</w:t>
+      </w:r>
+    </w:p>
+    <w:tbl>
+      <w:tblPr>
+        <w:tblW w:type="auto" w:w="0"/>
+        <w:tblLook w:firstColumn="1" w:firstRow="1" w:lastColumn="0" w:lastRow="0" w:noHBand="0" w:noVBand="1" w:val="04A0"/>
+        <w:tblBorders>
+          <w:top w:val="single" w:sz="4" w:color="D9D9D9"/>
+          <w:left w:val="single" w:sz="4" w:color="D9D9D9"/>
+          <w:bottom w:val="single" w:sz="4" w:color="D9D9D9"/>
+          <w:right w:val="single" w:sz="4" w:color="D9D9D9"/>
+          <w:insideH w:val="single" w:sz="4" w:color="D9D9D9"/>
+          <w:insideV w:val="single" w:sz="4" w:color="D9D9D9"/>
+        </w:tblBorders>
+      </w:tblPr>
+      <w:tblGrid>
+        <w:gridCol w:w="3360"/>
+        <w:gridCol w:w="3360"/>
+        <w:gridCol w:w="3360"/>
+      </w:tblGrid>
+      <w:tr>
+        <w:tc>
+          <w:tcPr>
+            <w:tcW w:type="dxa" w:w="3360"/>
+            <w:shd w:fill="182A4D"/>
+          </w:tcPr>
+          <w:p>
+            <w:r>
+              <w:rPr>
+                <w:b/>
+                <w:color w:val="FFFFFF"/>
+              </w:rPr>
+              <w:t>Model</w:t>
+            </w:r>
+          </w:p>
+        </w:tc>
+        <w:tc>
+          <w:tcPr>
+            <w:tcW w:type="dxa" w:w="3360"/>
+            <w:shd w:fill="182A4D"/>
+          </w:tcPr>
+          <w:p>
+            <w:r>
+              <w:rPr>
+                <w:b/>
+                <w:color w:val="FFFFFF"/>
+              </w:rPr>
+              <w:t>Effect Spearman</w:t>
+            </w:r>
+          </w:p>
+        </w:tc>
+        <w:tc>
+          <w:tcPr>
+            <w:tcW w:type="dxa" w:w="3360"/>
+            <w:shd w:fill="182A4D"/>
+          </w:tcPr>
+          <w:p>
+            <w:r>
+              <w:rPr>
+                <w:b/>
+                <w:color w:val="FFFFFF"/>
+              </w:rPr>
+              <w:t>Direction accuracy</w:t>
+            </w:r>
+          </w:p>
+        </w:tc>
+      </w:tr>
+      <w:tr>
+        <w:tc>
+          <w:tcPr>
+            <w:tcW w:type="dxa" w:w="3360"/>
+            <w:vAlign w:val="center"/>
+          </w:tcPr>
+          <w:p>
+            <w:r>
+              <w:t>CD274 RNA only</w:t>
+            </w:r>
+          </w:p>
+        </w:tc>
+        <w:tc>
+          <w:tcPr>
+            <w:tcW w:type="dxa" w:w="3360"/>
+            <w:vAlign w:val="center"/>
+          </w:tcPr>
+          <w:p>
+            <w:r>
+              <w:t>0.587</w:t>
+            </w:r>
+          </w:p>
+        </w:tc>
+        <w:tc>
+          <w:tcPr>
+            <w:tcW w:type="dxa" w:w="3360"/>
+            <w:vAlign w:val="center"/>
+          </w:tcPr>
+          <w:p>
+            <w:r>
+              <w:t>64.0%</w:t>
+            </w:r>
+          </w:p>
+        </w:tc>
+      </w:tr>
+      <w:tr>
+        <w:tc>
+          <w:tcPr>
+            <w:tcW w:type="dxa" w:w="3360"/>
+            <w:vAlign w:val="center"/>
+            <w:shd w:fill="F5F7FA"/>
+          </w:tcPr>
+          <w:p>
+            <w:r>
+              <w:t>totalVI decoder</w:t>
+            </w:r>
+          </w:p>
+        </w:tc>
+        <w:tc>
+          <w:tcPr>
+            <w:tcW w:type="dxa" w:w="3360"/>
+            <w:vAlign w:val="center"/>
+            <w:shd w:fill="F5F7FA"/>
+          </w:tcPr>
+          <w:p>
+            <w:r>
+              <w:t>0.767</w:t>
+            </w:r>
+          </w:p>
+        </w:tc>
+        <w:tc>
+          <w:tcPr>
+            <w:tcW w:type="dxa" w:w="3360"/>
+            <w:vAlign w:val="center"/>
+            <w:shd w:fill="F5F7FA"/>
+          </w:tcPr>
+          <w:p>
+            <w:r>
+              <w:t>76.0%</w:t>
+            </w:r>
+          </w:p>
+        </w:tc>
+      </w:tr>
+      <w:tr>
+        <w:tc>
+          <w:tcPr>
+            <w:tcW w:type="dxa" w:w="3360"/>
+            <w:vAlign w:val="center"/>
+          </w:tcPr>
+          <w:p>
+            <w:r>
+              <w:t>totalVI-X</w:t>
+            </w:r>
+          </w:p>
+        </w:tc>
+        <w:tc>
+          <w:tcPr>
+            <w:tcW w:type="dxa" w:w="3360"/>
+            <w:vAlign w:val="center"/>
+          </w:tcPr>
+          <w:p>
+            <w:r>
+              <w:t>0.841</w:t>
+            </w:r>
+          </w:p>
+        </w:tc>
+        <w:tc>
+          <w:tcPr>
+            <w:tcW w:type="dxa" w:w="3360"/>
+            <w:vAlign w:val="center"/>
+          </w:tcPr>
+          <w:p>
+            <w:r>
+              <w:t>82.7%</w:t>
+            </w:r>
+          </w:p>
+        </w:tc>
+      </w:tr>
+      <w:tr>
+        <w:tc>
+          <w:tcPr>
+            <w:tcW w:type="dxa" w:w="3360"/>
+            <w:vAlign w:val="center"/>
+            <w:shd w:fill="F5F7FA"/>
+          </w:tcPr>
+          <w:p>
+            <w:r>
+              <w:t>FusionVI decoder</w:t>
+            </w:r>
+          </w:p>
+        </w:tc>
+        <w:tc>
+          <w:tcPr>
+            <w:tcW w:type="dxa" w:w="3360"/>
+            <w:vAlign w:val="center"/>
+            <w:shd w:fill="F5F7FA"/>
+          </w:tcPr>
+          <w:p>
+            <w:r>
+              <w:t>0.820</w:t>
+            </w:r>
+          </w:p>
+        </w:tc>
+        <w:tc>
+          <w:tcPr>
+            <w:tcW w:type="dxa" w:w="3360"/>
+            <w:vAlign w:val="center"/>
+            <w:shd w:fill="F5F7FA"/>
+          </w:tcPr>
+          <w:p>
+            <w:r>
+              <w:t>77.3%</w:t>
+            </w:r>
+          </w:p>
+        </w:tc>
+      </w:tr>
+      <w:tr>
+        <w:tc>
+          <w:tcPr>
+            <w:tcW w:type="dxa" w:w="3360"/>
+            <w:vAlign w:val="center"/>
+          </w:tcPr>
+          <w:p>
+            <w:r>
+              <w:t>FusionVI-X</w:t>
+            </w:r>
+          </w:p>
+        </w:tc>
+        <w:tc>
+          <w:tcPr>
+            <w:tcW w:type="dxa" w:w="3360"/>
+            <w:vAlign w:val="center"/>
+          </w:tcPr>
+          <w:p>
+            <w:r>
+              <w:t>0.879</w:t>
+            </w:r>
+          </w:p>
+        </w:tc>
+        <w:tc>
+          <w:tcPr>
+            <w:tcW w:type="dxa" w:w="3360"/>
+            <w:vAlign w:val="center"/>
+          </w:tcPr>
+          <w:p>
+            <w:r>
+              <w:t>84.0%</w:t>
+            </w:r>
+          </w:p>
+        </w:tc>
+      </w:tr>
+    </w:tbl>
+    <w:p>
+      <w:pPr>
+        <w:pStyle w:val="Caption"/>
+        <w:jc w:val="center"/>
+        <w:keepLines/>
+      </w:pPr>
+      <w:r>
+        <w:t>Table 3. Prediction of held-out PD-L1 effects across 75 target-by-replicate estimates.</w:t>
+      </w:r>
+    </w:p>
+    <w:p>
+      <w:r>
+        <w:drawing>
+          <wp:inline xmlns:a="http://schemas.openxmlformats.org/drawingml/2006/main" xmlns:pic="http://schemas.openxmlformats.org/drawingml/2006/picture">
+            <wp:extent cx="6217920" cy="2426961"/>
+            <wp:docPr id="5" name="Picture 5"/>
+            <wp:cNvGraphicFramePr>
+              <a:graphicFrameLocks noChangeAspect="1"/>
+            </wp:cNvGraphicFramePr>
+            <a:graphic>
+              <a:graphicData uri="http://schemas.openxmlformats.org/drawingml/2006/picture">
+                <pic:pic>
+                  <pic:nvPicPr>
+                    <pic:cNvPr id="0" name="papalexi_external_validation.png"/>
+                    <pic:cNvPicPr/>
+                  </pic:nvPicPr>
+                  <pic:blipFill>
+                    <a:blip r:embed="rId14"/>
+                    <a:stretch>
+                      <a:fillRect/>
+                    </a:stretch>
+                  </pic:blipFill>
+                  <pic:spPr>
+                    <a:xfrm>
+                      <a:off x="0" y="0"/>
+                      <a:ext cx="6217920" cy="2426961"/>
+                    </a:xfrm>
+                    <a:prstGeom prst="rect"/>
+                  </pic:spPr>
+                </pic:pic>
+              </a:graphicData>
+            </a:graphic>
+          </wp:inline>
+        </w:drawing>
+      </w:r>
+    </w:p>
+    <w:p>
+      <w:pPr>
+        <w:pStyle w:val="Caption"/>
+        <w:jc w:val="center"/>
+        <w:keepLines/>
+      </w:pPr>
+      <w:r>
+        <w:t>Figure 6. Cross-modal readouts improve the ranking and direction of PD-L1 effects for unseen CRISPR targets.</w:t>
+      </w:r>
+    </w:p>
+    <w:p>
+      <w:r>
+        <w:br w:type="page"/>
+      </w:r>
+    </w:p>
+    <w:p>
+      <w:pPr>
+        <w:pStyle w:val="Heading2"/>
+        <w:keepLines/>
+        <w:keepNext/>
+      </w:pPr>
+      <w:r>
+        <w:t>Biological recovery and a useful failure</w:t>
+      </w:r>
+    </w:p>
+    <w:p>
+      <w:pPr>
+        <w:keepLines/>
+      </w:pPr>
+      <w:r>
+        <w:t>FusionVI-X recovered the strong loss of surface PD-L1 after perturbing JAK2, IFNGR1, IFNGR2 or STAT1, which disrupt the canonical IFN-gamma response. It also recovered increased PD-L1 after CUL3 or BRD4 perturbation, consistent with their reported roles as negative regulators. At the gene level, FusionVI-X reduced median absolute error by 0.0042 relative to totalVI-X across the 25 targets (paired Wilcoxon p = 0.042). The increment is modest; the larger improvement comes from adding a target-safe cross-modal readout to either latent representation.</w:t>
+      </w:r>
+    </w:p>
+    <w:p>
+      <w:pPr>
+        <w:keepLines/>
+      </w:pPr>
+      <w:r>
+        <w:t>CMTM6 provides the clearest negative result. Its perturbation strongly reduced surface PD-L1 while CD274 RNA moved slightly upward. FusionVI-X predicted almost no decrease. The model therefore recovered many unseen pathway perturbations but failed on a known post-transcriptional PD-L1-stability mechanism. SPI1 also produced opposite RNA and protein directions, but FusionVI-X recovered the protein decrease. These cases show why the external experiment is more informative than a simple classification benchmark.</w:t>
+      </w:r>
+    </w:p>
+    <w:p>
+      <w:r>
+        <w:drawing>
+          <wp:inline xmlns:a="http://schemas.openxmlformats.org/drawingml/2006/main" xmlns:pic="http://schemas.openxmlformats.org/drawingml/2006/picture">
+            <wp:extent cx="6217920" cy="2116084"/>
+            <wp:docPr id="6" name="Picture 6"/>
+            <wp:cNvGraphicFramePr>
+              <a:graphicFrameLocks noChangeAspect="1"/>
+            </wp:cNvGraphicFramePr>
+            <a:graphic>
+              <a:graphicData uri="http://schemas.openxmlformats.org/drawingml/2006/picture">
+                <pic:pic>
+                  <pic:nvPicPr>
+                    <pic:cNvPr id="0" name="papalexi_gene_effects.png"/>
+                    <pic:cNvPicPr/>
+                  </pic:nvPicPr>
+                  <pic:blipFill>
+                    <a:blip r:embed="rId15"/>
+                    <a:stretch>
+                      <a:fillRect/>
+                    </a:stretch>
+                  </pic:blipFill>
+                  <pic:spPr>
+                    <a:xfrm>
+                      <a:off x="0" y="0"/>
+                      <a:ext cx="6217920" cy="2116084"/>
+                    </a:xfrm>
+                    <a:prstGeom prst="rect"/>
+                  </pic:spPr>
+                </pic:pic>
+              </a:graphicData>
+            </a:graphic>
+          </wp:inline>
+        </w:drawing>
+      </w:r>
+    </w:p>
+    <w:p>
+      <w:pPr>
+        <w:pStyle w:val="Caption"/>
+        <w:jc w:val="center"/>
+        <w:keepLines/>
+      </w:pPr>
+      <w:r>
+        <w:t>Figure 7. Gene-level observed surface PD-L1 effects versus CD274 RNA, totalVI-X and FusionVI-X predictions. Labels identify established IFN-gamma regulators and RNA-protein-discordant cases.</w:t>
+      </w:r>
+    </w:p>
+    <w:p>
+      <w:r>
+        <w:br w:type="page"/>
+      </w:r>
+    </w:p>
+    <w:p>
+      <w:pPr>
+        <w:pStyle w:val="Heading1"/>
+        <w:keepLines/>
+        <w:keepNext/>
+      </w:pPr>
+      <w:r>
+        <w:t>8 Limitations</w:t>
       </w:r>
     </w:p>
     <w:p>
@@ -2132,12 +2581,30 @@
     </w:p>
     <w:p>
       <w:pPr>
+        <w:pStyle w:val="ListBullet"/>
+        <w:keepLines/>
+      </w:pPr>
+      <w:r>
+        <w:t>The Papalexi validation contains one IFN-gamma-stimulated cell line and only four surface proteins. It tests unseen mechanisms, not patient generalization.</w:t>
+      </w:r>
+    </w:p>
+    <w:p>
+      <w:pPr>
+        <w:pStyle w:val="ListBullet"/>
+        <w:keepLines/>
+      </w:pPr>
+      <w:r>
+        <w:t>The unseen-target split evaluates interpolation across related immune-regulatory pathways. It does not establish performance on a new drug, tissue or assay platform.</w:t>
+      </w:r>
+    </w:p>
+    <w:p>
+      <w:pPr>
         <w:pStyle w:val="Heading1"/>
         <w:keepLines/>
         <w:keepNext/>
       </w:pPr>
       <w:r>
-        <w:t>8 Conclusion and next experiment</w:t>
+        <w:t>9 Conclusion</w:t>
       </w:r>
     </w:p>
     <w:p>
@@ -2145,7 +2612,7 @@
         <w:keepLines/>
       </w:pPr>
       <w:r>
-        <w:t>FusionVI-X answered the project question with a positive and mechanistically interpretable result. A scalar gate alone changed modality reliance without improving prediction. A donor-nested target-specific readout then improved global recovery of CD25, CD69 and HLA-DR, and strongly rescued HLA-DR when its RNA and protein measurements disagreed. The next experiment should test whether the readout transfers to unseen perturbations, doses and timepoints, and whether pathway-level protein context can replace marker-specific supervision.</w:t>
+        <w:t>FusionVI-X answered the project question across two complementary settings. In primary PBMCs, a donor-nested readout improved recovery of CD25, CD69 and HLA-DR and strongly rescued HLA-DR when its RNA and protein measurements disagreed. In a separate CRISPR screen, the same cross-modal principle improved prediction of PD-L1 effects for unseen targets and recovered central IFN-gamma pathway regulators. The scalar gate alone remained weaker than the supervised readout, and the CMTM6 failure defines an important post-transcriptional boundary. The results support cross-modal context as a practical way to recover pharmacodynamic surface biomarkers while showing that specialized protein-stability mechanisms still require direct biological evidence.</w:t>
       </w:r>
     </w:p>
     <w:p>
@@ -2201,6 +2668,15 @@
       </w:pPr>
       <w:r>
         <w:t>Stoeckius M et al. Simultaneous epitope and transcriptome measurement in single cells. Nature Methods. 2017;14:865–868. doi:10.1038/nmeth.4380.</w:t>
+      </w:r>
+    </w:p>
+    <w:p>
+      <w:pPr>
+        <w:spacing w:after="60"/>
+        <w:ind w:left="288" w:hanging="288"/>
+      </w:pPr>
+      <w:r>
+        <w:t>Papalexi E et al. Characterizing the molecular regulation of inhibitory immune checkpoints with multimodal single-cell screens. Nature Genetics. 2021;53:322-331. doi:10.1038/s41588-021-00778-2.</w:t>
       </w:r>
     </w:p>
     <w:p>

</xml_diff>